<commit_message>
idk what change, but change was there
</commit_message>
<xml_diff>
--- a/Srikavipriyan M A Resume.docx
+++ b/Srikavipriyan M A Resume.docx
@@ -1,6 +1,6 @@
 
 <file path=word/document.xml><?xml version="1.0" encoding="utf-8"?>
-<w:document xmlns:o="urn:schemas-microsoft-com:office:office" xmlns:r="http://schemas.openxmlformats.org/officeDocument/2006/relationships" xmlns:v="urn:schemas-microsoft-com:vml" xmlns:w="http://schemas.openxmlformats.org/wordprocessingml/2006/main" xmlns:w10="urn:schemas-microsoft-com:office:word" xmlns:wp="http://schemas.openxmlformats.org/drawingml/2006/wordprocessingDrawing" xmlns:pic="http://schemas.openxmlformats.org/drawingml/2006/picture" xmlns:wps="http://schemas.microsoft.com/office/word/2010/wordprocessingShape" xmlns:wpg="http://schemas.microsoft.com/office/word/2010/wordprocessingGroup" xmlns:mc="http://schemas.openxmlformats.org/markup-compatibility/2006" xmlns:wp14="http://schemas.microsoft.com/office/word/2010/wordprocessingDrawing" xmlns:w14="http://schemas.microsoft.com/office/word/2010/wordml" xmlns:w15="http://schemas.microsoft.com/office/word/2012/wordml" mc:Ignorable="w14 wp14 w15">
+<w:document xmlns:o="urn:schemas-microsoft-com:office:office" xmlns:r="http://schemas.openxmlformats.org/officeDocument/2006/relationships" xmlns:v="urn:schemas-microsoft-com:vml" xmlns:w="http://schemas.openxmlformats.org/wordprocessingml/2006/main" xmlns:w10="urn:schemas-microsoft-com:office:word" xmlns:wp="http://schemas.openxmlformats.org/drawingml/2006/wordprocessingDrawing" xmlns:wps="http://schemas.microsoft.com/office/word/2010/wordprocessingShape" xmlns:wpg="http://schemas.microsoft.com/office/word/2010/wordprocessingGroup" xmlns:mc="http://schemas.openxmlformats.org/markup-compatibility/2006" xmlns:wp14="http://schemas.microsoft.com/office/word/2010/wordprocessingDrawing" xmlns:w14="http://schemas.microsoft.com/office/word/2010/wordml" xmlns:w15="http://schemas.microsoft.com/office/word/2012/wordml" mc:Ignorable="w14 wp14 w15">
   <w:body>
     <w:p>
       <w:pPr>
@@ -10,19 +10,42 @@
         <w:rPr/>
       </w:pPr>
       <w:r>
+        <w:rPr>
+          <w:rFonts w:cs="Times New Roman" w:ascii="Bookman Old Style" w:hAnsi="Bookman Old Style"/>
+          <w:sz w:val="48"/>
+          <w:szCs w:val="48"/>
+          <w:lang w:val="en-GB"/>
+        </w:rPr>
+        <w:t>Srikavipriyan M A</w:t>
+      </w:r>
+    </w:p>
+    <w:p>
+      <w:pPr>
+        <w:pStyle w:val="Normal"/>
+        <w:spacing w:lineRule="auto" w:line="240"/>
+        <w:jc w:val="center"/>
+        <w:rPr/>
+      </w:pPr>
+      <w:r>
+        <w:rPr>
+          <w:rFonts w:cs="Times New Roman" w:ascii="Bookman Old Style" w:hAnsi="Bookman Old Style"/>
+          <w:sz w:val="20"/>
+          <w:szCs w:val="20"/>
+          <w:lang w:val="en-GB"/>
+        </w:rPr>
         <w:drawing>
-          <wp:anchor behindDoc="0" distT="0" distB="0" distL="0" distR="0" simplePos="0" locked="0" layoutInCell="1" allowOverlap="1" relativeHeight="8">
+          <wp:anchor behindDoc="0" distT="0" distB="0" distL="0" distR="0" simplePos="0" locked="0" layoutInCell="1" allowOverlap="1" relativeHeight="6">
             <wp:simplePos x="0" y="0"/>
             <wp:positionH relativeFrom="column">
-              <wp:posOffset>1691640</wp:posOffset>
+              <wp:posOffset>3601720</wp:posOffset>
             </wp:positionH>
             <wp:positionV relativeFrom="paragraph">
-              <wp:posOffset>458470</wp:posOffset>
+              <wp:posOffset>5715</wp:posOffset>
             </wp:positionV>
-            <wp:extent cx="173990" cy="173990"/>
+            <wp:extent cx="146050" cy="146050"/>
             <wp:effectExtent l="0" t="0" r="0" b="0"/>
             <wp:wrapNone/>
-            <wp:docPr id="1" name="Graphic 10" descr=""/>
+            <wp:docPr id="1" name="Graphic 9" descr=""/>
             <wp:cNvGraphicFramePr>
               <a:graphicFrameLocks xmlns:a="http://schemas.openxmlformats.org/drawingml/2006/main" noChangeAspect="1"/>
             </wp:cNvGraphicFramePr>
@@ -30,7 +53,7 @@
               <a:graphicData uri="http://schemas.openxmlformats.org/drawingml/2006/picture">
                 <pic:pic xmlns:pic="http://schemas.openxmlformats.org/drawingml/2006/picture">
                   <pic:nvPicPr>
-                    <pic:cNvPr id="1" name="Graphic 10" descr=""/>
+                    <pic:cNvPr id="1" name="Graphic 9" descr=""/>
                     <pic:cNvPicPr>
                       <a:picLocks noChangeAspect="1" noChangeArrowheads="1"/>
                     </pic:cNvPicPr>
@@ -50,12 +73,11 @@
                   <pic:spPr bwMode="auto">
                     <a:xfrm>
                       <a:off x="0" y="0"/>
-                      <a:ext cx="173990" cy="173990"/>
+                      <a:ext cx="146050" cy="146050"/>
                     </a:xfrm>
                     <a:prstGeom prst="rect">
                       <a:avLst/>
                     </a:prstGeom>
-                    <a:noFill/>
                   </pic:spPr>
                 </pic:pic>
               </a:graphicData>
@@ -66,15 +88,15 @@
           <wp:anchor behindDoc="0" distT="0" distB="0" distL="0" distR="0" simplePos="0" locked="0" layoutInCell="1" allowOverlap="1" relativeHeight="9">
             <wp:simplePos x="0" y="0"/>
             <wp:positionH relativeFrom="column">
-              <wp:posOffset>5760085</wp:posOffset>
+              <wp:posOffset>111760</wp:posOffset>
             </wp:positionH>
             <wp:positionV relativeFrom="paragraph">
-              <wp:posOffset>452755</wp:posOffset>
+              <wp:posOffset>-15875</wp:posOffset>
             </wp:positionV>
-            <wp:extent cx="173990" cy="173990"/>
+            <wp:extent cx="167640" cy="167640"/>
             <wp:effectExtent l="0" t="0" r="0" b="0"/>
             <wp:wrapNone/>
-            <wp:docPr id="2" name="Graphic 11" descr=""/>
+            <wp:docPr id="2" name="Graphic 12" descr=""/>
             <wp:cNvGraphicFramePr>
               <a:graphicFrameLocks xmlns:a="http://schemas.openxmlformats.org/drawingml/2006/main" noChangeAspect="1"/>
             </wp:cNvGraphicFramePr>
@@ -82,7 +104,7 @@
               <a:graphicData uri="http://schemas.openxmlformats.org/drawingml/2006/picture">
                 <pic:pic xmlns:pic="http://schemas.openxmlformats.org/drawingml/2006/picture">
                   <pic:nvPicPr>
-                    <pic:cNvPr id="2" name="Graphic 11" descr=""/>
+                    <pic:cNvPr id="2" name="Graphic 12" descr=""/>
                     <pic:cNvPicPr>
                       <a:picLocks noChangeAspect="1" noChangeArrowheads="1"/>
                     </pic:cNvPicPr>
@@ -102,31 +124,48 @@
                   <pic:spPr bwMode="auto">
                     <a:xfrm>
                       <a:off x="0" y="0"/>
-                      <a:ext cx="173990" cy="173990"/>
+                      <a:ext cx="167640" cy="167640"/>
                     </a:xfrm>
                     <a:prstGeom prst="rect">
                       <a:avLst/>
                     </a:prstGeom>
-                    <a:noFill/>
                   </pic:spPr>
                 </pic:pic>
               </a:graphicData>
             </a:graphic>
           </wp:anchor>
         </w:drawing>
+        <w:t xml:space="preserve"> </w:t>
+      </w:r>
+      <w:r>
+        <w:rPr>
+          <w:rFonts w:cs="Times New Roman" w:ascii="Bookman Old Style" w:hAnsi="Bookman Old Style"/>
+          <w:sz w:val="20"/>
+          <w:szCs w:val="20"/>
+          <w:lang w:val="en-GB"/>
+        </w:rPr>
+        <w:t xml:space="preserve">+91-6363-628-542 |   </w:t>
+      </w:r>
+      <w:r>
+        <w:rPr>
+          <w:rFonts w:cs="Times New Roman" w:ascii="Bookman Old Style" w:hAnsi="Bookman Old Style"/>
+          <w:sz w:val="20"/>
+          <w:szCs w:val="20"/>
+          <w:lang w:val="en-GB"/>
+        </w:rPr>
         <w:drawing>
-          <wp:anchor behindDoc="0" distT="0" distB="0" distL="0" distR="0" simplePos="0" locked="0" layoutInCell="1" allowOverlap="1" relativeHeight="10">
+          <wp:anchor behindDoc="0" distT="0" distB="0" distL="0" distR="0" simplePos="0" locked="0" layoutInCell="1" allowOverlap="1" relativeHeight="7">
             <wp:simplePos x="0" y="0"/>
             <wp:positionH relativeFrom="column">
-              <wp:posOffset>167640</wp:posOffset>
+              <wp:posOffset>1627505</wp:posOffset>
             </wp:positionH>
             <wp:positionV relativeFrom="paragraph">
-              <wp:posOffset>451485</wp:posOffset>
+              <wp:posOffset>-8890</wp:posOffset>
             </wp:positionV>
-            <wp:extent cx="167640" cy="167640"/>
+            <wp:extent cx="173990" cy="173990"/>
             <wp:effectExtent l="0" t="0" r="0" b="0"/>
             <wp:wrapNone/>
-            <wp:docPr id="3" name="Graphic 12" descr=""/>
+            <wp:docPr id="3" name="Graphic 10" descr=""/>
             <wp:cNvGraphicFramePr>
               <a:graphicFrameLocks xmlns:a="http://schemas.openxmlformats.org/drawingml/2006/main" noChangeAspect="1"/>
             </wp:cNvGraphicFramePr>
@@ -134,7 +173,7 @@
               <a:graphicData uri="http://schemas.openxmlformats.org/drawingml/2006/picture">
                 <pic:pic xmlns:pic="http://schemas.openxmlformats.org/drawingml/2006/picture">
                   <pic:nvPicPr>
-                    <pic:cNvPr id="3" name="Graphic 12" descr=""/>
+                    <pic:cNvPr id="3" name="Graphic 10" descr=""/>
                     <pic:cNvPicPr>
                       <a:picLocks noChangeAspect="1" noChangeArrowheads="1"/>
                     </pic:cNvPicPr>
@@ -154,109 +193,20 @@
                   <pic:spPr bwMode="auto">
                     <a:xfrm>
                       <a:off x="0" y="0"/>
-                      <a:ext cx="167640" cy="167640"/>
+                      <a:ext cx="173990" cy="173990"/>
                     </a:xfrm>
                     <a:prstGeom prst="rect">
                       <a:avLst/>
                     </a:prstGeom>
-                    <a:noFill/>
                   </pic:spPr>
                 </pic:pic>
               </a:graphicData>
             </a:graphic>
           </wp:anchor>
         </w:drawing>
-      </w:r>
-      <w:r>
-        <w:rPr>
-          <w:rFonts w:cs="Times New Roman" w:ascii="Bookman Old Style" w:hAnsi="Bookman Old Style"/>
-          <w:sz w:val="48"/>
-          <w:szCs w:val="48"/>
-          <w:lang w:val="en-GB"/>
-        </w:rPr>
-        <w:t>Srikavipriyan M A</w:t>
-      </w:r>
-    </w:p>
-    <w:p>
-      <w:pPr>
-        <w:pStyle w:val="Normal"/>
-        <w:spacing w:lineRule="auto" w:line="240"/>
-        <w:jc w:val="center"/>
-        <w:rPr/>
-      </w:pPr>
-      <w:r>
-        <w:drawing>
-          <wp:anchor behindDoc="0" distT="0" distB="0" distL="0" distR="0" simplePos="0" locked="0" layoutInCell="1" allowOverlap="1" relativeHeight="7">
-            <wp:simplePos x="0" y="0"/>
-            <wp:positionH relativeFrom="column">
-              <wp:posOffset>3644900</wp:posOffset>
-            </wp:positionH>
-            <wp:positionV relativeFrom="paragraph">
-              <wp:posOffset>12700</wp:posOffset>
-            </wp:positionV>
-            <wp:extent cx="146050" cy="146050"/>
-            <wp:effectExtent l="0" t="0" r="0" b="0"/>
-            <wp:wrapNone/>
-            <wp:docPr id="4" name="Graphic 9" descr=""/>
-            <wp:cNvGraphicFramePr>
-              <a:graphicFrameLocks xmlns:a="http://schemas.openxmlformats.org/drawingml/2006/main" noChangeAspect="1"/>
-            </wp:cNvGraphicFramePr>
-            <a:graphic xmlns:a="http://schemas.openxmlformats.org/drawingml/2006/main">
-              <a:graphicData uri="http://schemas.openxmlformats.org/drawingml/2006/picture">
-                <pic:pic xmlns:pic="http://schemas.openxmlformats.org/drawingml/2006/picture">
-                  <pic:nvPicPr>
-                    <pic:cNvPr id="4" name="Graphic 9" descr=""/>
-                    <pic:cNvPicPr>
-                      <a:picLocks noChangeAspect="1" noChangeArrowheads="1"/>
-                    </pic:cNvPicPr>
-                  </pic:nvPicPr>
-                  <pic:blipFill>
-                    <a:blip r:embed="rId8">
-                      <a:extLst>
-                        <a:ext uri="{96DAC541-7B7A-43D3-8B79-37D633B846F1}">
-                          <asvg:svgBlip xmlns:asvg="http://schemas.microsoft.com/office/drawing/2016/SVG/main" r:embed="rId9"/>
-                        </a:ext>
-                      </a:extLst>
-                    </a:blip>
-                    <a:stretch>
-                      <a:fillRect/>
-                    </a:stretch>
-                  </pic:blipFill>
-                  <pic:spPr bwMode="auto">
-                    <a:xfrm>
-                      <a:off x="0" y="0"/>
-                      <a:ext cx="146050" cy="146050"/>
-                    </a:xfrm>
-                    <a:prstGeom prst="rect">
-                      <a:avLst/>
-                    </a:prstGeom>
-                    <a:noFill/>
-                  </pic:spPr>
-                </pic:pic>
-              </a:graphicData>
-            </a:graphic>
-          </wp:anchor>
-        </w:drawing>
-      </w:r>
-      <w:r>
-        <w:rPr>
-          <w:rFonts w:cs="Times New Roman" w:ascii="Bookman Old Style" w:hAnsi="Bookman Old Style"/>
-          <w:sz w:val="20"/>
-          <w:szCs w:val="20"/>
-          <w:lang w:val="en-GB"/>
-        </w:rPr>
-        <w:t xml:space="preserve"> </w:t>
-      </w:r>
-      <w:r>
-        <w:rPr>
-          <w:rFonts w:cs="Times New Roman" w:ascii="Bookman Old Style" w:hAnsi="Bookman Old Style"/>
-          <w:sz w:val="20"/>
-          <w:szCs w:val="20"/>
-          <w:lang w:val="en-GB"/>
-        </w:rPr>
-        <w:t xml:space="preserve">+91-6363-628-542 |     </w:t>
-      </w:r>
-      <w:hyperlink r:id="rId10">
+        <w:t xml:space="preserve">   </w:t>
+      </w:r>
+      <w:hyperlink r:id="rId8">
         <w:r>
           <w:rPr>
             <w:rStyle w:val="Hyperlink"/>
@@ -278,7 +228,7 @@
         </w:rPr>
         <w:t xml:space="preserve"> |     </w:t>
       </w:r>
-      <w:hyperlink r:id="rId11">
+      <w:hyperlink r:id="rId9">
         <w:r>
           <w:rPr>
             <w:rStyle w:val="Hyperlink"/>
@@ -293,12 +243,85 @@
       </w:hyperlink>
       <w:r>
         <w:rPr>
-          <w:rFonts w:cs="Times New Roman" w:ascii="Bookman Old Style" w:hAnsi="Bookman Old Style"/>
+          <w:rStyle w:val="Hyperlink"/>
+          <w:rFonts w:cs="Times New Roman" w:ascii="Bookman Old Style" w:hAnsi="Bookman Old Style"/>
+          <w:color w:val="auto"/>
           <w:sz w:val="20"/>
           <w:szCs w:val="20"/>
           <w:lang w:val="en-GB"/>
         </w:rPr>
-        <w:t xml:space="preserve">|    </w:t>
+        <w:t xml:space="preserve"> </w:t>
+      </w:r>
+      <w:r>
+        <w:rPr>
+          <w:rFonts w:cs="Times New Roman" w:ascii="Bookman Old Style" w:hAnsi="Bookman Old Style"/>
+          <w:sz w:val="20"/>
+          <w:szCs w:val="20"/>
+          <w:lang w:val="en-GB"/>
+        </w:rPr>
+        <w:t>|</w:t>
+      </w:r>
+      <w:r>
+        <w:drawing>
+          <wp:anchor behindDoc="0" distT="0" distB="0" distL="0" distR="0" simplePos="0" locked="0" layoutInCell="1" allowOverlap="1" relativeHeight="8">
+            <wp:simplePos x="0" y="0"/>
+            <wp:positionH relativeFrom="column">
+              <wp:posOffset>5801995</wp:posOffset>
+            </wp:positionH>
+            <wp:positionV relativeFrom="paragraph">
+              <wp:posOffset>-14605</wp:posOffset>
+            </wp:positionV>
+            <wp:extent cx="173990" cy="173990"/>
+            <wp:effectExtent l="0" t="0" r="0" b="0"/>
+            <wp:wrapNone/>
+            <wp:docPr id="4" name="Graphic 11" descr=""/>
+            <wp:cNvGraphicFramePr>
+              <a:graphicFrameLocks xmlns:a="http://schemas.openxmlformats.org/drawingml/2006/main" noChangeAspect="1"/>
+            </wp:cNvGraphicFramePr>
+            <a:graphic xmlns:a="http://schemas.openxmlformats.org/drawingml/2006/main">
+              <a:graphicData uri="http://schemas.openxmlformats.org/drawingml/2006/picture">
+                <pic:pic xmlns:pic="http://schemas.openxmlformats.org/drawingml/2006/picture">
+                  <pic:nvPicPr>
+                    <pic:cNvPr id="4" name="Graphic 11" descr=""/>
+                    <pic:cNvPicPr>
+                      <a:picLocks noChangeAspect="1" noChangeArrowheads="1"/>
+                    </pic:cNvPicPr>
+                  </pic:nvPicPr>
+                  <pic:blipFill>
+                    <a:blip r:embed="rId10">
+                      <a:extLst>
+                        <a:ext uri="{96DAC541-7B7A-43D3-8B79-37D633B846F1}">
+                          <asvg:svgBlip xmlns:asvg="http://schemas.microsoft.com/office/drawing/2016/SVG/main" r:embed="rId11"/>
+                        </a:ext>
+                      </a:extLst>
+                    </a:blip>
+                    <a:stretch>
+                      <a:fillRect/>
+                    </a:stretch>
+                  </pic:blipFill>
+                  <pic:spPr bwMode="auto">
+                    <a:xfrm>
+                      <a:off x="0" y="0"/>
+                      <a:ext cx="173990" cy="173990"/>
+                    </a:xfrm>
+                    <a:prstGeom prst="rect">
+                      <a:avLst/>
+                    </a:prstGeom>
+                  </pic:spPr>
+                </pic:pic>
+              </a:graphicData>
+            </a:graphic>
+          </wp:anchor>
+        </w:drawing>
+      </w:r>
+      <w:r>
+        <w:rPr>
+          <w:rFonts w:cs="Times New Roman" w:ascii="Bookman Old Style" w:hAnsi="Bookman Old Style"/>
+          <w:sz w:val="20"/>
+          <w:szCs w:val="20"/>
+          <w:lang w:val="en-GB"/>
+        </w:rPr>
+        <w:t xml:space="preserve">      </w:t>
       </w:r>
       <w:hyperlink r:id="rId12">
         <w:r>
@@ -386,13 +409,13 @@
         <mc:AlternateContent>
           <mc:Choice Requires="wps">
             <w:drawing>
-              <wp:anchor behindDoc="0" distT="3175" distB="3810" distL="635" distR="635" simplePos="0" locked="0" layoutInCell="0" allowOverlap="1" relativeHeight="12" wp14:anchorId="1D66C02A">
+              <wp:anchor behindDoc="0" distT="3175" distB="3810" distL="635" distR="635" simplePos="0" locked="0" layoutInCell="0" allowOverlap="1" relativeHeight="11" wp14:anchorId="1D66C02A">
                 <wp:simplePos x="0" y="0"/>
                 <wp:positionH relativeFrom="margin">
                   <wp:posOffset>0</wp:posOffset>
                 </wp:positionH>
                 <wp:positionV relativeFrom="paragraph">
-                  <wp:posOffset>1197610</wp:posOffset>
+                  <wp:posOffset>1162685</wp:posOffset>
                 </wp:positionV>
                 <wp:extent cx="6858000" cy="635"/>
                 <wp:effectExtent l="635" t="3175" r="635" b="3810"/>
@@ -437,7 +460,7 @@
           </mc:Choice>
           <mc:Fallback>
             <w:pict>
-              <v:line id="shape_0" from="0pt,94.3pt" to="539.95pt,94.3pt" ID="Straight Connector 3" stroked="t" o:allowincell="f" style="position:absolute;mso-position-horizontal-relative:margin" wp14:anchorId="1D66C02A">
+              <v:line id="shape_0" from="0pt,91.55pt" to="539.95pt,91.55pt" ID="Straight Connector 3" stroked="t" o:allowincell="f" style="position:absolute;mso-position-horizontal-relative:margin" wp14:anchorId="1D66C02A">
                 <v:stroke color="black" weight="6480" joinstyle="miter" endcap="flat"/>
                 <v:fill o:detectmouseclick="t" on="false"/>
                 <w10:wrap type="none"/>
@@ -501,12 +524,7 @@
         <w:spacing w:lineRule="auto" w:line="240"/>
         <w:ind w:firstLine="720"/>
         <w:jc w:val="both"/>
-        <w:rPr>
-          <w:rFonts w:ascii="Bookman Old Style" w:hAnsi="Bookman Old Style" w:cs="Times New Roman"/>
-          <w:sz w:val="18"/>
-          <w:szCs w:val="18"/>
-          <w:lang w:val="en-GB"/>
-        </w:rPr>
+        <w:rPr/>
       </w:pPr>
       <w:bookmarkStart w:id="0" w:name="_Hlk171194985"/>
       <w:r>
@@ -516,9 +534,54 @@
           <w:szCs w:val="18"/>
           <w:lang w:val="en-GB"/>
         </w:rPr>
-        <w:t>Proficient in Python (core and agentic AI) and Flutter, I am seeking a challenging role where I can contribute to the development of innovative software and application solutions. With a strong foundation in programming and a passion for building intelligent systems, I aim to grow professionally through collaborative work, continuous learning, and real-world problem solving in a dynamic tech-driven environment.</w:t>
+        <w:t>Proficient in Python (</w:t>
+      </w:r>
+      <w:r>
+        <w:rPr>
+          <w:rFonts w:cs="Times New Roman" w:ascii="Bookman Old Style" w:hAnsi="Bookman Old Style"/>
+          <w:sz w:val="18"/>
+          <w:szCs w:val="18"/>
+          <w:lang w:val="en-GB"/>
+        </w:rPr>
+        <w:t>C</w:t>
+      </w:r>
+      <w:r>
+        <w:rPr>
+          <w:rFonts w:cs="Times New Roman" w:ascii="Bookman Old Style" w:hAnsi="Bookman Old Style"/>
+          <w:sz w:val="18"/>
+          <w:szCs w:val="18"/>
+          <w:lang w:val="en-GB"/>
+        </w:rPr>
+        <w:t xml:space="preserve">ore and </w:t>
+      </w:r>
+      <w:r>
+        <w:rPr>
+          <w:rFonts w:cs="Times New Roman" w:ascii="Bookman Old Style" w:hAnsi="Bookman Old Style"/>
+          <w:sz w:val="18"/>
+          <w:szCs w:val="18"/>
+          <w:lang w:val="en-GB"/>
+        </w:rPr>
+        <w:t>A</w:t>
+      </w:r>
+      <w:r>
+        <w:rPr>
+          <w:rFonts w:cs="Times New Roman" w:ascii="Bookman Old Style" w:hAnsi="Bookman Old Style"/>
+          <w:sz w:val="18"/>
+          <w:szCs w:val="18"/>
+          <w:lang w:val="en-GB"/>
+        </w:rPr>
+        <w:t>gentic AI) and Flutter, I am seeking a challenging role where I can contribute to the development of innovative software and application solutions. With a strong foundation in programming and a passion for building intelligent systems, I aim to grow professionally through collaborative work, continuous learning, and real-world problem solving in a dynamic tech-driven environment</w:t>
       </w:r>
       <w:bookmarkEnd w:id="0"/>
+      <w:r>
+        <w:rPr>
+          <w:rFonts w:cs="Times New Roman" w:ascii="Bookman Old Style" w:hAnsi="Bookman Old Style"/>
+          <w:sz w:val="18"/>
+          <w:szCs w:val="18"/>
+          <w:lang w:val="en-GB"/>
+        </w:rPr>
+        <w:t>.</w:t>
+      </w:r>
     </w:p>
     <w:p>
       <w:pPr>
@@ -529,18 +592,24 @@
       <w:r>
         <w:rPr>
           <w:rStyle w:val="Hyperlink"/>
+          <w:rFonts w:cs="Times New Roman" w:ascii="Bookman Old Style" w:hAnsi="Bookman Old Style"/>
           <w:color w:val="auto"/>
           <w:sz w:val="28"/>
           <w:szCs w:val="28"/>
           <w:u w:val="none"/>
+          <w:lang w:val="en-GB"/>
         </w:rPr>
         <w:t>E</w:t>
       </w:r>
       <w:r>
         <w:rPr>
           <w:rStyle w:val="Hyperlink"/>
+          <w:rFonts w:cs="Times New Roman" w:ascii="Bookman Old Style" w:hAnsi="Bookman Old Style"/>
           <w:color w:val="auto"/>
+          <w:sz w:val="18"/>
+          <w:szCs w:val="18"/>
           <w:u w:val="none"/>
+          <w:lang w:val="en-GB"/>
         </w:rPr>
         <w:t>DUCATION</w:t>
       </w:r>
@@ -596,7 +665,29 @@
           <w:szCs w:val="18"/>
           <w:lang w:val="en-GB"/>
         </w:rPr>
-        <w:t>Sep 2021 – May 2025</w:t>
+        <w:t xml:space="preserve">Sep 2021 – </w:t>
+      </w:r>
+      <w:r>
+        <w:rPr>
+          <w:rFonts w:cs="Times New Roman" w:ascii="Bookman Old Style" w:hAnsi="Bookman Old Style"/>
+          <w:b/>
+          <w:bCs/>
+          <w:sz w:val="18"/>
+          <w:szCs w:val="18"/>
+          <w:lang w:val="en-GB"/>
+        </w:rPr>
+        <w:t>Sep</w:t>
+      </w:r>
+      <w:r>
+        <w:rPr>
+          <w:rFonts w:cs="Times New Roman" w:ascii="Bookman Old Style" w:hAnsi="Bookman Old Style"/>
+          <w:b/>
+          <w:bCs/>
+          <w:sz w:val="18"/>
+          <w:szCs w:val="18"/>
+          <w:lang w:val="en-GB"/>
+        </w:rPr>
+        <w:t xml:space="preserve"> 2025</w:t>
       </w:r>
     </w:p>
     <w:p>
@@ -811,7 +902,7 @@
                   <wp:posOffset>-3810</wp:posOffset>
                 </wp:positionH>
                 <wp:positionV relativeFrom="paragraph">
-                  <wp:posOffset>205740</wp:posOffset>
+                  <wp:posOffset>194310</wp:posOffset>
                 </wp:positionV>
                 <wp:extent cx="6858000" cy="635"/>
                 <wp:effectExtent l="635" t="3175" r="0" b="3810"/>
@@ -856,7 +947,7 @@
           </mc:Choice>
           <mc:Fallback>
             <w:pict>
-              <v:line id="shape_0" from="-0.3pt,16.2pt" to="539.65pt,16.2pt" ID="Straight Connector 1" stroked="t" o:allowincell="f" style="position:absolute;mso-position-horizontal-relative:margin" wp14:anchorId="5BEB71B8">
+              <v:line id="shape_0" from="-0.3pt,15.3pt" to="539.65pt,15.3pt" ID="Straight Connector 1" stroked="t" o:allowincell="f" style="position:absolute;mso-position-horizontal-relative:margin" wp14:anchorId="5BEB71B8">
                 <v:stroke color="black" weight="6480" joinstyle="miter" endcap="flat"/>
                 <v:fill o:detectmouseclick="t" on="false"/>
                 <w10:wrap type="none"/>
@@ -1042,27 +1133,6 @@
           <w:lang w:val="en-GB"/>
         </w:rPr>
         <w:t>MySQL, SQLite3, Firebase Storage, MongoDB</w:t>
-      </w:r>
-    </w:p>
-    <w:p>
-      <w:pPr>
-        <w:pStyle w:val="Normal"/>
-        <w:spacing w:lineRule="auto" w:line="240" w:before="0" w:after="160"/>
-        <w:contextualSpacing/>
-        <w:rPr>
-          <w:rFonts w:ascii="Bookman Old Style" w:hAnsi="Bookman Old Style" w:cs="Times New Roman"/>
-          <w:sz w:val="18"/>
-          <w:szCs w:val="18"/>
-          <w:lang w:val="en-GB"/>
-        </w:rPr>
-      </w:pPr>
-      <w:r>
-        <w:rPr>
-          <w:rFonts w:cs="Times New Roman" w:ascii="Bookman Old Style" w:hAnsi="Bookman Old Style"/>
-          <w:sz w:val="18"/>
-          <w:szCs w:val="18"/>
-          <w:lang w:val="en-GB"/>
-        </w:rPr>
       </w:r>
     </w:p>
     <w:p>
@@ -1081,7 +1151,7 @@
                   <wp:posOffset>1905</wp:posOffset>
                 </wp:positionH>
                 <wp:positionV relativeFrom="paragraph">
-                  <wp:posOffset>207010</wp:posOffset>
+                  <wp:posOffset>201295</wp:posOffset>
                 </wp:positionV>
                 <wp:extent cx="6858000" cy="635"/>
                 <wp:effectExtent l="0" t="3175" r="635" b="3810"/>
@@ -1126,7 +1196,7 @@
           </mc:Choice>
           <mc:Fallback>
             <w:pict>
-              <v:line id="shape_0" from="0.15pt,16.3pt" to="540.1pt,16.3pt" ID="Straight Connector 1" stroked="t" o:allowincell="f" style="position:absolute;mso-position-horizontal-relative:margin" wp14:anchorId="728A7CD9">
+              <v:line id="shape_0" from="0.15pt,15.85pt" to="540.1pt,15.85pt" ID="Straight Connector 1" stroked="t" o:allowincell="f" style="position:absolute;mso-position-horizontal-relative:margin" wp14:anchorId="728A7CD9">
                 <v:stroke color="black" weight="6480" joinstyle="miter" endcap="flat"/>
                 <v:fill o:detectmouseclick="t" on="false"/>
                 <w10:wrap type="none"/>
@@ -1187,6 +1257,128 @@
           <w:szCs w:val="18"/>
           <w:lang w:val="en-GB"/>
         </w:rPr>
+        <w:t>Systems Engineer</w:t>
+      </w:r>
+      <w:r>
+        <w:rPr>
+          <w:rFonts w:cs="Times New Roman" w:ascii="Bookman Old Style" w:hAnsi="Bookman Old Style"/>
+          <w:b/>
+          <w:bCs/>
+          <w:sz w:val="18"/>
+          <w:szCs w:val="18"/>
+          <w:lang w:val="en-GB"/>
+        </w:rPr>
+        <w:t xml:space="preserve">, </w:t>
+      </w:r>
+      <w:r>
+        <w:rPr>
+          <w:rFonts w:cs="Times New Roman" w:ascii="Bookman Old Style" w:hAnsi="Bookman Old Style"/>
+          <w:b/>
+          <w:bCs/>
+          <w:sz w:val="18"/>
+          <w:szCs w:val="18"/>
+          <w:lang w:val="en-GB"/>
+        </w:rPr>
+        <w:t>TCS</w:t>
+      </w:r>
+      <w:r>
+        <w:rPr>
+          <w:rFonts w:cs="Times New Roman" w:ascii="Bookman Old Style" w:hAnsi="Bookman Old Style"/>
+          <w:b/>
+          <w:bCs/>
+          <w:sz w:val="18"/>
+          <w:szCs w:val="18"/>
+          <w:lang w:val="en-GB"/>
+        </w:rPr>
+        <w:tab/>
+        <w:tab/>
+        <w:tab/>
+        <w:tab/>
+        <w:tab/>
+        <w:tab/>
+        <w:tab/>
+        <w:tab/>
+        <w:tab/>
+      </w:r>
+      <w:r>
+        <w:rPr>
+          <w:rFonts w:cs="Times New Roman" w:ascii="Bookman Old Style" w:hAnsi="Bookman Old Style"/>
+          <w:b/>
+          <w:bCs/>
+          <w:sz w:val="18"/>
+          <w:szCs w:val="18"/>
+          <w:lang w:val="en-GB"/>
+        </w:rPr>
+        <w:t>Nov</w:t>
+      </w:r>
+      <w:r>
+        <w:rPr>
+          <w:rFonts w:cs="Times New Roman" w:ascii="Bookman Old Style" w:hAnsi="Bookman Old Style"/>
+          <w:b/>
+          <w:bCs/>
+          <w:sz w:val="18"/>
+          <w:szCs w:val="18"/>
+          <w:lang w:val="en-GB"/>
+        </w:rPr>
+        <w:t xml:space="preserve"> 2025 – </w:t>
+      </w:r>
+      <w:r>
+        <w:rPr>
+          <w:rFonts w:cs="Times New Roman" w:ascii="Bookman Old Style" w:hAnsi="Bookman Old Style"/>
+          <w:b/>
+          <w:bCs/>
+          <w:sz w:val="18"/>
+          <w:szCs w:val="18"/>
+          <w:lang w:val="en-GB"/>
+        </w:rPr>
+        <w:t>Present</w:t>
+      </w:r>
+    </w:p>
+    <w:p>
+      <w:pPr>
+        <w:pStyle w:val="Normal"/>
+        <w:spacing w:lineRule="auto" w:line="240" w:before="0" w:after="0"/>
+        <w:contextualSpacing/>
+        <w:rPr>
+          <w:rFonts w:ascii="Bookman Old Style" w:hAnsi="Bookman Old Style" w:cs="Times New Roman"/>
+          <w:b/>
+          <w:bCs/>
+          <w:sz w:val="18"/>
+          <w:szCs w:val="18"/>
+          <w:lang w:val="en-GB"/>
+        </w:rPr>
+      </w:pPr>
+      <w:r>
+        <w:rPr/>
+      </w:r>
+    </w:p>
+    <w:p>
+      <w:pPr>
+        <w:pStyle w:val="Normal"/>
+        <w:spacing w:lineRule="auto" w:line="240" w:before="0" w:after="0"/>
+        <w:contextualSpacing/>
+        <w:rPr/>
+      </w:pPr>
+      <w:r>
+        <w:rPr>
+          <w:rFonts w:cs="Times New Roman" w:ascii="Bookman Old Style" w:hAnsi="Bookman Old Style"/>
+          <w:b/>
+          <w:bCs/>
+          <w:sz w:val="18"/>
+          <w:szCs w:val="18"/>
+          <w:lang w:val="en-GB"/>
+        </w:rPr>
+        <w:t xml:space="preserve">    </w:t>
+      </w:r>
+      <w:r>
+        <w:rPr>
+          <w:rFonts w:cs="Times New Roman" w:ascii="Bookman Old Style" w:hAnsi="Bookman Old Style"/>
+          <w:b/>
+          <w:bCs/>
+          <w:sz w:val="18"/>
+          <w:szCs w:val="18"/>
+          <w:lang w:val="en-GB"/>
+        </w:rPr>
         <w:t>AI Intern Lead at 2CentsCapital, UAE</w:t>
         <w:tab/>
         <w:tab/>
@@ -1195,7 +1387,57 @@
         <w:tab/>
         <w:tab/>
         <w:tab/>
-        <w:t>Sep 2025 – Present</w:t>
+        <w:t>Oct 2025 – Nov 2025</w:t>
+      </w:r>
+    </w:p>
+    <w:p>
+      <w:pPr>
+        <w:pStyle w:val="Normal"/>
+        <w:spacing w:lineRule="auto" w:line="240" w:before="0" w:after="0"/>
+        <w:contextualSpacing/>
+        <w:rPr/>
+      </w:pPr>
+      <w:r>
+        <w:rPr>
+          <w:rFonts w:cs="Times New Roman" w:ascii="Bookman Old Style" w:hAnsi="Bookman Old Style"/>
+          <w:b/>
+          <w:bCs/>
+          <w:sz w:val="18"/>
+          <w:szCs w:val="18"/>
+          <w:lang w:val="en-GB"/>
+        </w:rPr>
+        <w:t xml:space="preserve">    </w:t>
+      </w:r>
+      <w:r>
+        <w:rPr>
+          <w:rFonts w:cs="Times New Roman" w:ascii="Bookman Old Style" w:hAnsi="Bookman Old Style"/>
+          <w:b/>
+          <w:bCs/>
+          <w:sz w:val="18"/>
+          <w:szCs w:val="18"/>
+          <w:lang w:val="en-GB"/>
+        </w:rPr>
+        <w:t>AI Intern at 2CentsCapital, UAE</w:t>
+        <w:tab/>
+        <w:tab/>
+        <w:tab/>
+        <w:tab/>
+        <w:tab/>
+        <w:tab/>
+        <w:tab/>
+        <w:tab/>
+        <w:t xml:space="preserve">Sep 2025 – </w:t>
+      </w:r>
+      <w:r>
+        <w:rPr>
+          <w:rFonts w:cs="Times New Roman" w:ascii="Bookman Old Style" w:hAnsi="Bookman Old Style"/>
+          <w:b/>
+          <w:bCs/>
+          <w:sz w:val="18"/>
+          <w:szCs w:val="18"/>
+          <w:lang w:val="en-GB"/>
+        </w:rPr>
+        <w:t>Oct 2025</w:t>
       </w:r>
     </w:p>
     <w:p>
@@ -1207,12 +1449,50 @@
         </w:numPr>
         <w:spacing w:lineRule="auto" w:line="240" w:before="0" w:after="0"/>
         <w:contextualSpacing/>
-        <w:rPr>
-          <w:rFonts w:ascii="Bookman Old Style" w:hAnsi="Bookman Old Style" w:cs="Times New Roman"/>
-          <w:sz w:val="18"/>
-          <w:szCs w:val="18"/>
-          <w:lang w:val="en-GB"/>
-        </w:rPr>
+        <w:rPr/>
+      </w:pPr>
+      <w:r>
+        <w:rPr>
+          <w:rFonts w:cs="Times New Roman" w:ascii="Bookman Old Style" w:hAnsi="Bookman Old Style"/>
+          <w:sz w:val="18"/>
+          <w:szCs w:val="18"/>
+          <w:lang w:val="en-GB"/>
+        </w:rPr>
+        <w:t>Worked on existing React framework to integrate seamless streaming interface with minimal latency via API</w:t>
+      </w:r>
+    </w:p>
+    <w:p>
+      <w:pPr>
+        <w:pStyle w:val="BodyText"/>
+        <w:numPr>
+          <w:ilvl w:val="0"/>
+          <w:numId w:val="0"/>
+        </w:numPr>
+        <w:spacing w:lineRule="auto" w:line="240" w:before="0" w:after="0"/>
+        <w:ind w:hanging="0" w:left="720"/>
+        <w:contextualSpacing/>
+        <w:rPr/>
+      </w:pPr>
+      <w:r>
+        <w:rPr>
+          <w:rFonts w:cs="Times New Roman" w:ascii="Bookman Old Style" w:hAnsi="Bookman Old Style"/>
+          <w:sz w:val="18"/>
+          <w:szCs w:val="18"/>
+          <w:lang w:val="en-GB"/>
+        </w:rPr>
+        <w:t>calls to Python AI framework.</w:t>
+      </w:r>
+    </w:p>
+    <w:p>
+      <w:pPr>
+        <w:pStyle w:val="BodyText"/>
+        <w:numPr>
+          <w:ilvl w:val="0"/>
+          <w:numId w:val="3"/>
+        </w:numPr>
+        <w:spacing w:lineRule="auto" w:line="240" w:before="0" w:after="0"/>
+        <w:contextualSpacing/>
+        <w:rPr/>
       </w:pPr>
       <w:r>
         <w:rPr>
@@ -1232,7 +1512,18 @@
           <w:szCs w:val="18"/>
           <w:lang w:val="en-GB"/>
         </w:rPr>
-        <w:t>Agno</w:t>
+        <w:t>Agno’</w:t>
+      </w:r>
+      <w:r>
+        <w:rPr>
+          <w:rFonts w:cs="Times New Roman" w:ascii="Bookman Old Style" w:hAnsi="Bookman Old Style"/>
+          <w:b/>
+          <w:bCs/>
+          <w:sz w:val="18"/>
+          <w:szCs w:val="18"/>
+          <w:lang w:val="en-GB"/>
+        </w:rPr>
+        <w:t>s AgentOS</w:t>
       </w:r>
       <w:r>
         <w:rPr>
@@ -1292,7 +1583,18 @@
           <w:szCs w:val="18"/>
           <w:lang w:val="en-GB"/>
         </w:rPr>
-        <w:t>YFinance</w:t>
+        <w:t xml:space="preserve">Yfinance, </w:t>
+      </w:r>
+      <w:r>
+        <w:rPr>
+          <w:rFonts w:cs="Times New Roman" w:ascii="Bookman Old Style" w:hAnsi="Bookman Old Style"/>
+          <w:b/>
+          <w:bCs/>
+          <w:sz w:val="18"/>
+          <w:szCs w:val="18"/>
+          <w:lang w:val="en-GB"/>
+        </w:rPr>
+        <w:t>GTN</w:t>
       </w:r>
       <w:r>
         <w:rPr>
@@ -1332,12 +1634,7 @@
           <w:numId w:val="3"/>
         </w:numPr>
         <w:spacing w:lineRule="auto" w:line="240"/>
-        <w:rPr>
-          <w:rFonts w:ascii="Bookman Old Style" w:hAnsi="Bookman Old Style" w:cs="Times New Roman"/>
-          <w:sz w:val="18"/>
-          <w:szCs w:val="18"/>
-          <w:lang w:val="en-GB"/>
-        </w:rPr>
+        <w:rPr/>
       </w:pPr>
       <w:r>
         <w:rPr>
@@ -1373,14 +1670,7 @@
         <w:pStyle w:val="Normal"/>
         <w:spacing w:lineRule="auto" w:line="240" w:before="0" w:after="0"/>
         <w:contextualSpacing/>
-        <w:rPr>
-          <w:rFonts w:ascii="Bookman Old Style" w:hAnsi="Bookman Old Style" w:cs="Times New Roman"/>
-          <w:b/>
-          <w:bCs/>
-          <w:sz w:val="18"/>
-          <w:szCs w:val="18"/>
-          <w:lang w:val="en-GB"/>
-        </w:rPr>
+        <w:rPr/>
       </w:pPr>
       <w:r>
         <w:rPr>
@@ -1476,6 +1766,22 @@
           <w:lang w:val="en-GB"/>
         </w:rPr>
         <w:t>Created videos for students to learn topics based on Flutter and Java.</w:t>
+      </w:r>
+    </w:p>
+    <w:p>
+      <w:pPr>
+        <w:pStyle w:val="ListParagraph"/>
+        <w:spacing w:lineRule="auto" w:line="240" w:before="0" w:after="0"/>
+        <w:contextualSpacing/>
+        <w:rPr>
+          <w:rFonts w:ascii="Bookman Old Style" w:hAnsi="Bookman Old Style" w:cs="Times New Roman"/>
+          <w:sz w:val="18"/>
+          <w:szCs w:val="18"/>
+          <w:lang w:val="en-GB"/>
+        </w:rPr>
+      </w:pPr>
+      <w:r>
+        <w:rPr/>
       </w:r>
     </w:p>
     <w:p>
@@ -1592,12 +1898,7 @@
         </w:numPr>
         <w:spacing w:lineRule="auto" w:line="240" w:before="0" w:after="0"/>
         <w:contextualSpacing/>
-        <w:rPr>
-          <w:rFonts w:ascii="Bookman Old Style" w:hAnsi="Bookman Old Style" w:cs="Times New Roman"/>
-          <w:sz w:val="18"/>
-          <w:szCs w:val="18"/>
-          <w:lang w:val="en-GB"/>
-        </w:rPr>
+        <w:rPr/>
       </w:pPr>
       <w:r>
         <w:rPr>
@@ -1607,31 +1908,6 @@
           <w:lang w:val="en-GB"/>
         </w:rPr>
         <w:t>Contributed to spatial audio research by collecting and organizing numerous audio samples for analysis.</w:t>
-      </w:r>
-    </w:p>
-    <w:p>
-      <w:pPr>
-        <w:pStyle w:val="ListParagraph"/>
-        <w:numPr>
-          <w:ilvl w:val="1"/>
-          <w:numId w:val="4"/>
-        </w:numPr>
-        <w:spacing w:lineRule="auto" w:line="240" w:before="0" w:after="0"/>
-        <w:contextualSpacing/>
-        <w:rPr>
-          <w:rFonts w:ascii="Bookman Old Style" w:hAnsi="Bookman Old Style" w:cs="Times New Roman"/>
-          <w:sz w:val="18"/>
-          <w:szCs w:val="18"/>
-          <w:lang w:val="en-GB"/>
-        </w:rPr>
-      </w:pPr>
-      <w:r>
-        <w:rPr>
-          <w:rFonts w:cs="Times New Roman" w:ascii="Bookman Old Style" w:hAnsi="Bookman Old Style"/>
-          <w:sz w:val="18"/>
-          <w:szCs w:val="18"/>
-          <w:lang w:val="en-GB"/>
-        </w:rPr>
       </w:r>
     </w:p>
     <w:p>
@@ -1650,7 +1926,7 @@
                   <wp:posOffset>1905</wp:posOffset>
                 </wp:positionH>
                 <wp:positionV relativeFrom="paragraph">
-                  <wp:posOffset>218440</wp:posOffset>
+                  <wp:posOffset>189865</wp:posOffset>
                 </wp:positionV>
                 <wp:extent cx="6858000" cy="635"/>
                 <wp:effectExtent l="0" t="3175" r="635" b="3175"/>
@@ -1695,7 +1971,7 @@
           </mc:Choice>
           <mc:Fallback>
             <w:pict>
-              <v:line id="shape_0" from="0.15pt,17.2pt" to="540.1pt,17.2pt" ID="Straight Connector 1" stroked="t" o:allowincell="f" style="position:absolute;mso-position-horizontal-relative:margin" wp14:anchorId="35A35A18">
+              <v:line id="shape_0" from="0.15pt,14.95pt" to="540.1pt,14.95pt" ID="Straight Connector 1" stroked="t" o:allowincell="f" style="position:absolute;mso-position-horizontal-relative:margin" wp14:anchorId="35A35A18">
                 <v:stroke color="black" weight="6480" joinstyle="miter" endcap="flat"/>
                 <v:fill o:detectmouseclick="t" on="false"/>
                 <w10:wrap type="none"/>
@@ -1706,13 +1982,13 @@
         <mc:AlternateContent>
           <mc:Choice Requires="wps">
             <w:drawing>
-              <wp:anchor behindDoc="0" distT="3175" distB="3175" distL="0" distR="635" simplePos="0" locked="0" layoutInCell="0" allowOverlap="1" relativeHeight="11" wp14:anchorId="35A35A18">
+              <wp:anchor behindDoc="0" distT="3175" distB="3175" distL="0" distR="635" simplePos="0" locked="0" layoutInCell="0" allowOverlap="1" relativeHeight="10" wp14:anchorId="35A35A18">
                 <wp:simplePos x="0" y="0"/>
                 <wp:positionH relativeFrom="margin">
                   <wp:posOffset>1905</wp:posOffset>
                 </wp:positionH>
                 <wp:positionV relativeFrom="paragraph">
-                  <wp:posOffset>944245</wp:posOffset>
+                  <wp:posOffset>909955</wp:posOffset>
                 </wp:positionV>
                 <wp:extent cx="6858000" cy="635"/>
                 <wp:effectExtent l="0" t="3175" r="635" b="3175"/>
@@ -1757,7 +2033,7 @@
           </mc:Choice>
           <mc:Fallback>
             <w:pict>
-              <v:line id="shape_0" from="0.15pt,74.35pt" to="540.1pt,74.35pt" ID="Straight Connector 2" stroked="t" o:allowincell="f" style="position:absolute;mso-position-horizontal-relative:margin" wp14:anchorId="35A35A18">
+              <v:line id="shape_0" from="0.15pt,71.65pt" to="540.1pt,71.65pt" ID="Straight Connector 2" stroked="t" o:allowincell="f" style="position:absolute;mso-position-horizontal-relative:margin" wp14:anchorId="35A35A18">
                 <v:stroke color="black" weight="6480" joinstyle="miter" endcap="flat"/>
                 <v:fill o:detectmouseclick="t" on="false"/>
                 <w10:wrap type="none"/>
@@ -1820,31 +2096,7 @@
           <w:lang w:val="en-GB"/>
         </w:rPr>
         <w:t>HackerRank (Python, Java, SQL, Problem Solving), Spoken Tutorial – IIT Bombay (Python, Java, Advanced C/C++, PHP &amp; MySQL), NPTEL (Google Cloud Computing Foundations, Forests and their Management, Wildlife Ecology)</w:t>
-      </w:r>
-    </w:p>
-    <w:p>
-      <w:pPr>
-        <w:pStyle w:val="Normal"/>
-        <w:spacing w:lineRule="auto" w:line="240" w:before="0" w:after="0"/>
-        <w:rPr>
-          <w:rStyle w:val="Hyperlink"/>
-          <w:rFonts w:ascii="Bookman Old Style" w:hAnsi="Bookman Old Style" w:cs="Times New Roman"/>
-          <w:color w:themeColor="hyperlink" w:val="auto"/>
-          <w:sz w:val="18"/>
-          <w:szCs w:val="18"/>
-          <w:u w:val="none"/>
-          <w:lang w:val="en-GB"/>
-        </w:rPr>
-      </w:pPr>
-      <w:r>
-        <w:rPr>
-          <w:rFonts w:cs="Times New Roman" w:ascii="Bookman Old Style" w:hAnsi="Bookman Old Style"/>
-          <w:color w:val="auto"/>
-          <w:sz w:val="18"/>
-          <w:szCs w:val="18"/>
-          <w:u w:val="none"/>
-          <w:lang w:val="en-GB"/>
-        </w:rPr>
+        <w:br/>
       </w:r>
     </w:p>
     <w:p>
@@ -1906,38 +2158,7 @@
       <w:pPr>
         <w:pStyle w:val="Normal"/>
         <w:spacing w:lineRule="auto" w:line="240" w:before="0" w:after="0"/>
-        <w:rPr>
-          <w:rFonts w:ascii="Bookman Old Style" w:hAnsi="Bookman Old Style" w:cs="Times New Roman"/>
-          <w:b/>
-          <w:bCs/>
-          <w:sz w:val="18"/>
-          <w:szCs w:val="18"/>
-          <w:lang w:val="en-GB"/>
-        </w:rPr>
-      </w:pPr>
-      <w:r>
-        <w:rPr>
-          <w:rFonts w:cs="Times New Roman" w:ascii="Bookman Old Style" w:hAnsi="Bookman Old Style"/>
-          <w:b/>
-          <w:bCs/>
-          <w:sz w:val="18"/>
-          <w:szCs w:val="18"/>
-          <w:lang w:val="en-GB"/>
-        </w:rPr>
-      </w:r>
-    </w:p>
-    <w:p>
-      <w:pPr>
-        <w:pStyle w:val="Normal"/>
-        <w:spacing w:lineRule="auto" w:line="240" w:before="0" w:after="0"/>
-        <w:rPr>
-          <w:rFonts w:ascii="Bookman Old Style" w:hAnsi="Bookman Old Style" w:cs="Times New Roman"/>
-          <w:b/>
-          <w:bCs/>
-          <w:sz w:val="18"/>
-          <w:szCs w:val="18"/>
-          <w:lang w:val="en-GB"/>
-        </w:rPr>
+        <w:rPr/>
       </w:pPr>
       <w:r>
         <w:rPr>
@@ -2296,7 +2517,7 @@
         <w:rPr>
           <w:rStyle w:val="Hyperlink"/>
           <w:rFonts w:ascii="Bookman Old Style" w:hAnsi="Bookman Old Style" w:cs="Times New Roman"/>
-          <w:color w:themeColor="hyperlink" w:val="auto"/>
+          <w:color w:val="auto"/>
           <w:sz w:val="18"/>
           <w:szCs w:val="18"/>
           <w:u w:val="none"/>
@@ -2304,187 +2525,7 @@
         </w:rPr>
       </w:pPr>
       <w:r>
-        <w:rPr>
-          <w:rFonts w:cs="Times New Roman" w:ascii="Bookman Old Style" w:hAnsi="Bookman Old Style"/>
-          <w:color w:val="auto"/>
-          <w:sz w:val="18"/>
-          <w:szCs w:val="18"/>
-          <w:u w:val="none"/>
-          <w:lang w:val="en-GB"/>
-        </w:rPr>
-      </w:r>
-    </w:p>
-    <w:p>
-      <w:pPr>
-        <w:pStyle w:val="Normal"/>
-        <w:spacing w:lineRule="auto" w:line="240" w:before="0" w:after="0"/>
-        <w:rPr/>
-      </w:pPr>
-      <w:r>
-        <mc:AlternateContent>
-          <mc:Choice Requires="wps">
-            <w:drawing>
-              <wp:anchor behindDoc="0" distT="3810" distB="3810" distL="0" distR="635" simplePos="0" locked="0" layoutInCell="0" allowOverlap="1" relativeHeight="6" wp14:anchorId="1714F926">
-                <wp:simplePos x="0" y="0"/>
-                <wp:positionH relativeFrom="margin">
-                  <wp:posOffset>-3175</wp:posOffset>
-                </wp:positionH>
-                <wp:positionV relativeFrom="paragraph">
-                  <wp:posOffset>197485</wp:posOffset>
-                </wp:positionV>
-                <wp:extent cx="6858000" cy="635"/>
-                <wp:effectExtent l="0" t="3810" r="635" b="3810"/>
-                <wp:wrapNone/>
-                <wp:docPr id="11" name="Straight Connector 1"/>
-                <a:graphic xmlns:a="http://schemas.openxmlformats.org/drawingml/2006/main">
-                  <a:graphicData uri="http://schemas.microsoft.com/office/word/2010/wordprocessingShape">
-                    <wps:wsp>
-                      <wps:cNvSpPr/>
-                      <wps:spPr>
-                        <a:xfrm>
-                          <a:off x="0" y="0"/>
-                          <a:ext cx="6858000" cy="720"/>
-                        </a:xfrm>
-                        <a:prstGeom prst="line">
-                          <a:avLst/>
-                        </a:prstGeom>
-                        <a:ln>
-                          <a:solidFill>
-                            <a:srgbClr val="000000"/>
-                          </a:solidFill>
-                        </a:ln>
-                      </wps:spPr>
-                      <wps:style>
-                        <a:lnRef idx="1">
-                          <a:schemeClr val="dk1"/>
-                        </a:lnRef>
-                        <a:fillRef idx="0">
-                          <a:schemeClr val="dk1"/>
-                        </a:fillRef>
-                        <a:effectRef idx="0">
-                          <a:schemeClr val="dk1"/>
-                        </a:effectRef>
-                        <a:fontRef idx="minor"/>
-                      </wps:style>
-                      <wps:bodyPr/>
-                    </wps:wsp>
-                  </a:graphicData>
-                </a:graphic>
-              </wp:anchor>
-            </w:drawing>
-          </mc:Choice>
-          <mc:Fallback>
-            <w:pict>
-              <v:line id="shape_0" from="-0.25pt,15.55pt" to="539.7pt,15.55pt" ID="Straight Connector 1" stroked="t" o:allowincell="f" style="position:absolute;mso-position-horizontal-relative:margin" wp14:anchorId="1714F926">
-                <v:stroke color="black" weight="6480" joinstyle="miter" endcap="flat"/>
-                <v:fill o:detectmouseclick="t" on="false"/>
-                <w10:wrap type="none"/>
-              </v:line>
-            </w:pict>
-          </mc:Fallback>
-        </mc:AlternateContent>
-      </w:r>
-      <w:r>
-        <w:rPr>
-          <w:rStyle w:val="Hyperlink"/>
-          <w:rFonts w:cs="Times New Roman" w:ascii="Bookman Old Style" w:hAnsi="Bookman Old Style"/>
-          <w:color w:val="auto"/>
-          <w:sz w:val="28"/>
-          <w:szCs w:val="28"/>
-          <w:u w:val="none"/>
-          <w:lang w:val="en-GB"/>
-        </w:rPr>
-        <w:t>C</w:t>
-      </w:r>
-      <w:r>
-        <w:rPr>
-          <w:rStyle w:val="Hyperlink"/>
-          <w:rFonts w:cs="Times New Roman" w:ascii="Bookman Old Style" w:hAnsi="Bookman Old Style"/>
-          <w:color w:val="auto"/>
-          <w:sz w:val="18"/>
-          <w:szCs w:val="18"/>
-          <w:u w:val="none"/>
-          <w:lang w:val="en-GB"/>
-        </w:rPr>
-        <w:t xml:space="preserve">LUBS AND </w:t>
-      </w:r>
-      <w:r>
-        <w:rPr>
-          <w:rStyle w:val="Hyperlink"/>
-          <w:rFonts w:cs="Times New Roman" w:ascii="Bookman Old Style" w:hAnsi="Bookman Old Style"/>
-          <w:color w:val="auto"/>
-          <w:sz w:val="28"/>
-          <w:szCs w:val="28"/>
-          <w:u w:val="none"/>
-          <w:lang w:val="en-GB"/>
-        </w:rPr>
-        <w:t>V</w:t>
-      </w:r>
-      <w:r>
-        <w:rPr>
-          <w:rStyle w:val="Hyperlink"/>
-          <w:rFonts w:cs="Times New Roman" w:ascii="Bookman Old Style" w:hAnsi="Bookman Old Style"/>
-          <w:color w:val="auto"/>
-          <w:sz w:val="18"/>
-          <w:szCs w:val="18"/>
-          <w:u w:val="none"/>
-          <w:lang w:val="en-GB"/>
-        </w:rPr>
-        <w:t>OLUNTEERING</w:t>
-      </w:r>
-    </w:p>
-    <w:p>
-      <w:pPr>
-        <w:pStyle w:val="ListParagraph"/>
-        <w:numPr>
-          <w:ilvl w:val="0"/>
-          <w:numId w:val="0"/>
-        </w:numPr>
-        <w:spacing w:lineRule="auto" w:line="240"/>
-        <w:ind w:hanging="0" w:left="720"/>
-        <w:rPr>
-          <w:rStyle w:val="Hyperlink"/>
-          <w:rFonts w:ascii="Bookman Old Style" w:hAnsi="Bookman Old Style" w:cs="Times New Roman"/>
-          <w:color w:themeColor="hyperlink" w:val="auto"/>
-          <w:sz w:val="18"/>
-          <w:szCs w:val="18"/>
-          <w:u w:val="none"/>
-          <w:lang w:val="en-GB"/>
-        </w:rPr>
-      </w:pPr>
-      <w:r>
-        <w:rPr>
-          <w:rFonts w:cs="Times New Roman" w:ascii="Bookman Old Style" w:hAnsi="Bookman Old Style"/>
-          <w:color w:val="auto"/>
-          <w:sz w:val="18"/>
-          <w:szCs w:val="18"/>
-          <w:u w:val="none"/>
-          <w:lang w:val="en-GB"/>
-        </w:rPr>
-      </w:r>
-    </w:p>
-    <w:p>
-      <w:pPr>
-        <w:pStyle w:val="ListParagraph"/>
-        <w:numPr>
-          <w:ilvl w:val="0"/>
-          <w:numId w:val="5"/>
-        </w:numPr>
-        <w:spacing w:lineRule="auto" w:line="240" w:before="0" w:after="160"/>
-        <w:contextualSpacing/>
-        <w:rPr/>
-      </w:pPr>
-      <w:r>
-        <w:rPr>
-          <w:rStyle w:val="Hyperlink"/>
-          <w:rFonts w:cs="Times New Roman" w:ascii="Bookman Old Style" w:hAnsi="Bookman Old Style"/>
-          <w:color w:val="auto"/>
-          <w:sz w:val="18"/>
-          <w:szCs w:val="18"/>
-          <w:u w:val="none"/>
-          <w:lang w:val="en-GB"/>
-        </w:rPr>
-        <w:t>App developer at Microsoft Innovations Club VITC; 1 TN BTN NCC Blood Donation Drive.</w:t>
+        <w:rPr/>
       </w:r>
     </w:p>
     <w:sectPr>
@@ -3053,143 +3094,6 @@
   <w:abstractNum w:abstractNumId="5">
     <w:lvl w:ilvl="0">
       <w:start w:val="1"/>
-      <w:numFmt w:val="bullet"/>
-      <w:lvlText w:val=""/>
-      <w:lvlJc w:val="left"/>
-      <w:pPr>
-        <w:tabs>
-          <w:tab w:val="num" w:pos="0"/>
-        </w:tabs>
-        <w:ind w:left="720" w:hanging="360"/>
-      </w:pPr>
-      <w:rPr>
-        <w:rFonts w:ascii="Symbol" w:hAnsi="Symbol" w:cs="Symbol" w:hint="default"/>
-      </w:rPr>
-    </w:lvl>
-    <w:lvl w:ilvl="1">
-      <w:start w:val="1"/>
-      <w:numFmt w:val="bullet"/>
-      <w:lvlText w:val="o"/>
-      <w:lvlJc w:val="left"/>
-      <w:pPr>
-        <w:tabs>
-          <w:tab w:val="num" w:pos="0"/>
-        </w:tabs>
-        <w:ind w:left="1440" w:hanging="360"/>
-      </w:pPr>
-      <w:rPr>
-        <w:rFonts w:ascii="Courier New" w:hAnsi="Courier New" w:cs="Courier New" w:hint="default"/>
-      </w:rPr>
-    </w:lvl>
-    <w:lvl w:ilvl="2">
-      <w:start w:val="1"/>
-      <w:numFmt w:val="bullet"/>
-      <w:lvlText w:val=""/>
-      <w:lvlJc w:val="left"/>
-      <w:pPr>
-        <w:tabs>
-          <w:tab w:val="num" w:pos="0"/>
-        </w:tabs>
-        <w:ind w:left="2160" w:hanging="360"/>
-      </w:pPr>
-      <w:rPr>
-        <w:rFonts w:ascii="Wingdings" w:hAnsi="Wingdings" w:cs="Wingdings" w:hint="default"/>
-      </w:rPr>
-    </w:lvl>
-    <w:lvl w:ilvl="3">
-      <w:start w:val="1"/>
-      <w:numFmt w:val="bullet"/>
-      <w:lvlText w:val=""/>
-      <w:lvlJc w:val="left"/>
-      <w:pPr>
-        <w:tabs>
-          <w:tab w:val="num" w:pos="0"/>
-        </w:tabs>
-        <w:ind w:left="2880" w:hanging="360"/>
-      </w:pPr>
-      <w:rPr>
-        <w:rFonts w:ascii="Symbol" w:hAnsi="Symbol" w:cs="Symbol" w:hint="default"/>
-      </w:rPr>
-    </w:lvl>
-    <w:lvl w:ilvl="4">
-      <w:start w:val="1"/>
-      <w:numFmt w:val="bullet"/>
-      <w:lvlText w:val="o"/>
-      <w:lvlJc w:val="left"/>
-      <w:pPr>
-        <w:tabs>
-          <w:tab w:val="num" w:pos="0"/>
-        </w:tabs>
-        <w:ind w:left="3600" w:hanging="360"/>
-      </w:pPr>
-      <w:rPr>
-        <w:rFonts w:ascii="Courier New" w:hAnsi="Courier New" w:cs="Courier New" w:hint="default"/>
-      </w:rPr>
-    </w:lvl>
-    <w:lvl w:ilvl="5">
-      <w:start w:val="1"/>
-      <w:numFmt w:val="bullet"/>
-      <w:lvlText w:val=""/>
-      <w:lvlJc w:val="left"/>
-      <w:pPr>
-        <w:tabs>
-          <w:tab w:val="num" w:pos="0"/>
-        </w:tabs>
-        <w:ind w:left="4320" w:hanging="360"/>
-      </w:pPr>
-      <w:rPr>
-        <w:rFonts w:ascii="Wingdings" w:hAnsi="Wingdings" w:cs="Wingdings" w:hint="default"/>
-      </w:rPr>
-    </w:lvl>
-    <w:lvl w:ilvl="6">
-      <w:start w:val="1"/>
-      <w:numFmt w:val="bullet"/>
-      <w:lvlText w:val=""/>
-      <w:lvlJc w:val="left"/>
-      <w:pPr>
-        <w:tabs>
-          <w:tab w:val="num" w:pos="0"/>
-        </w:tabs>
-        <w:ind w:left="5040" w:hanging="360"/>
-      </w:pPr>
-      <w:rPr>
-        <w:rFonts w:ascii="Symbol" w:hAnsi="Symbol" w:cs="Symbol" w:hint="default"/>
-      </w:rPr>
-    </w:lvl>
-    <w:lvl w:ilvl="7">
-      <w:start w:val="1"/>
-      <w:numFmt w:val="bullet"/>
-      <w:lvlText w:val="o"/>
-      <w:lvlJc w:val="left"/>
-      <w:pPr>
-        <w:tabs>
-          <w:tab w:val="num" w:pos="0"/>
-        </w:tabs>
-        <w:ind w:left="5760" w:hanging="360"/>
-      </w:pPr>
-      <w:rPr>
-        <w:rFonts w:ascii="Courier New" w:hAnsi="Courier New" w:cs="Courier New" w:hint="default"/>
-      </w:rPr>
-    </w:lvl>
-    <w:lvl w:ilvl="8">
-      <w:start w:val="1"/>
-      <w:numFmt w:val="bullet"/>
-      <w:lvlText w:val=""/>
-      <w:lvlJc w:val="left"/>
-      <w:pPr>
-        <w:tabs>
-          <w:tab w:val="num" w:pos="0"/>
-        </w:tabs>
-        <w:ind w:left="6480" w:hanging="360"/>
-      </w:pPr>
-      <w:rPr>
-        <w:rFonts w:ascii="Wingdings" w:hAnsi="Wingdings" w:cs="Wingdings" w:hint="default"/>
-      </w:rPr>
-    </w:lvl>
-  </w:abstractNum>
-  <w:abstractNum w:abstractNumId="6">
-    <w:lvl w:ilvl="0">
-      <w:start w:val="1"/>
       <w:numFmt w:val="none"/>
       <w:suff w:val="nothing"/>
       <w:lvlText w:val=""/>
@@ -3320,9 +3224,6 @@
   </w:num>
   <w:num w:numId="5">
     <w:abstractNumId w:val="5"/>
-  </w:num>
-  <w:num w:numId="6">
-    <w:abstractNumId w:val="6"/>
   </w:num>
 </w:numbering>
 </file>
@@ -3732,7 +3633,7 @@
       <w:widowControl/>
       <w:suppressAutoHyphens w:val="true"/>
       <w:bidi w:val="0"/>
-      <w:spacing w:lineRule="auto" w:line="259" w:before="0" w:after="160"/>
+      <w:spacing w:lineRule="exact" w:line="288" w:before="0" w:after="160"/>
       <w:jc w:val="left"/>
     </w:pPr>
     <w:rPr>
@@ -3825,8 +3726,8 @@
       <w:u w:val="single"/>
     </w:rPr>
   </w:style>
-  <w:style w:type="character" w:styleId="Bulletsuser">
-    <w:name w:val="Bullets (user)"/>
+  <w:style w:type="character" w:styleId="Bullets">
+    <w:name w:val="Bullets"/>
     <w:qFormat/>
     <w:rPr>
       <w:rFonts w:ascii="OpenSymbol" w:hAnsi="OpenSymbol" w:eastAsia="OpenSymbol" w:cs="OpenSymbol"/>
@@ -3864,7 +3765,7 @@
     </w:rPr>
   </w:style>
   <w:style w:type="paragraph" w:styleId="Caption">
-    <w:name w:val="caption"/>
+    <w:name w:val="Caption"/>
     <w:basedOn w:val="Normal"/>
     <w:qFormat/>
     <w:pPr>

</xml_diff>